<commit_message>
docs: secao MVC descreve routes como endpoints/controladores
Esclarece que src/routes/*.js define os endpoints da API REST e atua como camada Controller do MVC.
</commit_message>
<xml_diff>
--- a/Relatorio_PWBiblioteca.docx
+++ b/Relatorio_PWBiblioteca.docx
@@ -1855,7 +1855,7 @@
               <w:spacing w:after="0"/>
             </w:pPr>
             <w:r>
-              <w:t xml:space="preserve">Controller</w:t>
+              <w:t xml:space="preserve">Controller (endpoints)</w:t>
             </w:r>
           </w:p>
         </w:tc>
@@ -1883,7 +1883,7 @@
               <w:spacing w:after="0"/>
             </w:pPr>
             <w:r>
-              <w:t xml:space="preserve">Wrappers HTTP finos que recebem o pedido e chamam os servicos</w:t>
+              <w:t xml:space="preserve">Definem os endpoints da API REST (rotas HTTP) e tratam o pedido/resposta, invocando o servico adequado e devolvendo o status + JSON</w:t>
             </w:r>
           </w:p>
         </w:tc>
@@ -1983,7 +1983,7 @@
         <w:pStyle w:val="Normal"/>
       </w:pPr>
       <w:r>
-        <w:t xml:space="preserve">Os servicos seguem o padrao (app) =&gt; ({ ... }), recebendo a instancia da aplicacao (e o acesso a base de dados app.db). As rotas e os servicos sao carregados automaticamente pela biblioteca consign, ficando disponiveis em app.services.&lt;nome&gt; e app.routes.&lt;nome&gt;. O ficheiro src/config/router.js liga cada conjunto de rotas ao respetivo prefixo (por exemplo, /v1/livros, /v1/reservas).</w:t>
+        <w:t xml:space="preserve">Os servicos seguem o padrao (app) =&gt; ({ ... }), recebendo a instancia da aplicacao (e o acesso a base de dados app.db). As rotas e os servicos sao carregados automaticamente pela biblioteca consign, ficando disponiveis em app.services.&lt;nome&gt; e app.routes.&lt;nome&gt;. O ficheiro src/config/router.js liga cada conjunto de rotas ao respetivo prefixo (por exemplo, /v1/livros, /v1/reservas). Cada metodo de rota (GET, POST, PUT, DELETE) corresponde a um endpoint da API e desempenha o papel de controlador, ligando o pedido HTTP a operacao de negocio no servico.</w:t>
       </w:r>
     </w:p>
     <w:p>

</xml_diff>